<commit_message>
Revisione Pattern: Factory Method, aggiunta UML corretto, dettagli codice e documentazione
</commit_message>
<xml_diff>
--- a/designPattern/FactoryMethod/Documentazione pattern Factory Method.docx
+++ b/designPattern/FactoryMethod/Documentazione pattern Factory Method.docx
@@ -18,27 +18,7 @@
           <w:sz w:val="28"/>
           <w:szCs w:val="28"/>
         </w:rPr>
-        <w:t xml:space="preserve">Documentazione pattern </w:t>
-      </w:r>
-      <w:proofErr w:type="spellStart"/>
-      <w:r>
-        <w:rPr>
-          <w:b/>
-          <w:bCs/>
-          <w:sz w:val="28"/>
-          <w:szCs w:val="28"/>
-        </w:rPr>
-        <w:t>Factory</w:t>
-      </w:r>
-      <w:proofErr w:type="spellEnd"/>
-      <w:r>
-        <w:rPr>
-          <w:b/>
-          <w:bCs/>
-          <w:sz w:val="28"/>
-          <w:szCs w:val="28"/>
-        </w:rPr>
-        <w:t xml:space="preserve"> Method</w:t>
+        <w:t>Documentazione pattern Factory Method</w:t>
       </w:r>
     </w:p>
     <w:p>
@@ -58,32 +38,76 @@
     </w:p>
     <w:p>
       <w:r>
-        <w:t xml:space="preserve">Il </w:t>
-      </w:r>
-      <w:proofErr w:type="spellStart"/>
-      <w:r>
-        <w:t>Factory</w:t>
-      </w:r>
-      <w:proofErr w:type="spellEnd"/>
-      <w:r>
-        <w:t xml:space="preserve"> Method è un pattern </w:t>
-      </w:r>
-      <w:proofErr w:type="spellStart"/>
-      <w:r>
-        <w:t>creazionale</w:t>
-      </w:r>
-      <w:proofErr w:type="spellEnd"/>
-      <w:r>
-        <w:t xml:space="preserve"> che serve a creare oggetti senza specificare direttamente la loro classe concreta nel </w:t>
-      </w:r>
-      <w:r>
-        <w:t>client.</w:t>
-      </w:r>
-      <w:r>
-        <w:t xml:space="preserve"> L'idea centrale è definire un metodo di creazione in una classe base e lasciare alle sottoclassi la decisione su quale oggetto concreto </w:t>
-      </w:r>
-      <w:r>
-        <w:t>istanziare.</w:t>
+        <w:t>Il Factory Method è un pattern creazionale che serve a creare oggetti senza specificare direttamente la loro classe concreta nel client. L'idea centrale è definire un metodo di creazione in una classe base e lasciare alle sottoclassi la decisione su quale oggetto concreto istanziare.</w:t>
+      </w:r>
+    </w:p>
+    <w:p>
+      <w:r>
+        <w:t>Il pattern è costituito dai seguenti attori:</w:t>
+      </w:r>
+    </w:p>
+    <w:p>
+      <w:pPr>
+        <w:pStyle w:val="Paragrafoelenco"/>
+        <w:numPr>
+          <w:ilvl w:val="0"/>
+          <w:numId w:val="1"/>
+        </w:numPr>
+      </w:pPr>
+      <w:r>
+        <w:rPr>
+          <w:b/>
+          <w:bCs/>
+        </w:rPr>
+        <w:t>Product</w:t>
+      </w:r>
+    </w:p>
+    <w:p>
+      <w:pPr>
+        <w:pStyle w:val="Paragrafoelenco"/>
+        <w:numPr>
+          <w:ilvl w:val="0"/>
+          <w:numId w:val="1"/>
+        </w:numPr>
+      </w:pPr>
+      <w:r>
+        <w:rPr>
+          <w:b/>
+          <w:bCs/>
+        </w:rPr>
+        <w:t>ConcreteProduct</w:t>
+      </w:r>
+    </w:p>
+    <w:p>
+      <w:pPr>
+        <w:pStyle w:val="Paragrafoelenco"/>
+        <w:numPr>
+          <w:ilvl w:val="0"/>
+          <w:numId w:val="1"/>
+        </w:numPr>
+      </w:pPr>
+      <w:r>
+        <w:rPr>
+          <w:b/>
+          <w:bCs/>
+        </w:rPr>
+        <w:t>Creator</w:t>
+      </w:r>
+    </w:p>
+    <w:p>
+      <w:pPr>
+        <w:pStyle w:val="Paragrafoelenco"/>
+        <w:numPr>
+          <w:ilvl w:val="0"/>
+          <w:numId w:val="1"/>
+        </w:numPr>
+      </w:pPr>
+      <w:r>
+        <w:rPr>
+          <w:b/>
+          <w:bCs/>
+        </w:rPr>
+        <w:t>ConcreteCreator</w:t>
       </w:r>
     </w:p>
     <w:p>
@@ -103,38 +127,7 @@
     </w:p>
     <w:p>
       <w:r>
-        <w:t xml:space="preserve">Nell'esempio, il sistema gestisce notifiche di tipo diverso, come </w:t>
-      </w:r>
-      <w:r>
-        <w:t>e-mail</w:t>
-      </w:r>
-      <w:r>
-        <w:t xml:space="preserve"> e </w:t>
-      </w:r>
-      <w:r>
-        <w:t>SMS.</w:t>
-      </w:r>
-      <w:r>
-        <w:t xml:space="preserve"> Il client non crea direttamente </w:t>
-      </w:r>
-      <w:proofErr w:type="spellStart"/>
-      <w:r>
-        <w:t>EmailNotifica</w:t>
-      </w:r>
-      <w:proofErr w:type="spellEnd"/>
-      <w:r>
-        <w:t> o </w:t>
-      </w:r>
-      <w:proofErr w:type="spellStart"/>
-      <w:r>
-        <w:t>SmsNotifica</w:t>
-      </w:r>
-      <w:proofErr w:type="spellEnd"/>
-      <w:r>
-        <w:t xml:space="preserve">, ma usa un creator che si occupa della creazione dell'oggetto </w:t>
-      </w:r>
-      <w:r>
-        <w:t>corretto.</w:t>
+        <w:t>Nell'esempio, il sistema gestisce notifiche di tipo diverso, come e-mail e SMS. Il client non crea direttamente EmailNotifica o SmsNotifica, ma usa un creator che si occupa della creazione dell'oggetto corretto.</w:t>
       </w:r>
     </w:p>
     <w:p>
@@ -164,11 +157,17 @@
         <w:t>Product</w:t>
       </w:r>
       <w:r>
-        <w:t>, cioè il tipo generale dei prodotti che il sistema può usare.</w:t>
-      </w:r>
-    </w:p>
-    <w:p>
-      <w:r>
+        <w:t>, cioè il tipo generale dei prodotti che il sistema può usare</w:t>
+      </w:r>
+      <w:r>
+        <w:t xml:space="preserve"> definendo quali operazioni essi svolgono, in questo caso solo l’invio di un messaggio.</w:t>
+      </w:r>
+    </w:p>
+    <w:p>
+      <w:r>
+        <w:rPr>
+          <w:noProof/>
+        </w:rPr>
         <w:drawing>
           <wp:inline distT="0" distB="0" distL="0" distR="0" wp14:anchorId="105EEE34" wp14:editId="4313245C">
             <wp:extent cx="6645910" cy="584835"/>
@@ -185,7 +184,7 @@
                     <pic:cNvPicPr/>
                   </pic:nvPicPr>
                   <pic:blipFill>
-                    <a:blip r:embed="rId5"/>
+                    <a:blip r:embed="rId6"/>
                     <a:stretch>
                       <a:fillRect/>
                     </a:stretch>
@@ -207,32 +206,9 @@
       </w:r>
     </w:p>
     <w:p>
-      <w:pPr>
-        <w:rPr>
-          <w:b/>
-          <w:bCs/>
-        </w:rPr>
-      </w:pPr>
-      <w:r>
-        <w:t xml:space="preserve"> Le classi </w:t>
-      </w:r>
-      <w:proofErr w:type="spellStart"/>
-      <w:r>
-        <w:t>EmailNotifica</w:t>
-      </w:r>
-      <w:proofErr w:type="spellEnd"/>
-      <w:r>
-        <w:t> e </w:t>
-      </w:r>
-      <w:proofErr w:type="spellStart"/>
-      <w:r>
-        <w:t>SmsNotifica</w:t>
-      </w:r>
-      <w:proofErr w:type="spellEnd"/>
-      <w:r>
-        <w:t> sono i </w:t>
-      </w:r>
-      <w:proofErr w:type="spellStart"/>
+      <w:r>
+        <w:t xml:space="preserve"> Le classi EmailNotifica e SmsNotifica sono i </w:t>
+      </w:r>
       <w:r>
         <w:rPr>
           <w:b/>
@@ -240,12 +216,20 @@
         </w:rPr>
         <w:t>ConcreteProduct</w:t>
       </w:r>
-      <w:proofErr w:type="spellEnd"/>
-      <w:r>
-        <w:rPr>
-          <w:b/>
-          <w:bCs/>
-        </w:rPr>
+      <w:r>
+        <w:rPr>
+          <w:b/>
+          <w:bCs/>
+        </w:rPr>
+        <w:t xml:space="preserve">, </w:t>
+      </w:r>
+      <w:r>
+        <w:t>loro implementano l’interfaccia e svolgono i compiti da essa definiti in modo concreto</w:t>
+      </w:r>
+      <w:r>
+        <w:t>, cioè inviare un messaggio</w:t>
+      </w:r>
+      <w:r>
         <w:t>.</w:t>
       </w:r>
     </w:p>
@@ -261,6 +245,7 @@
         <w:rPr>
           <w:b/>
           <w:bCs/>
+          <w:noProof/>
         </w:rPr>
         <w:drawing>
           <wp:inline distT="0" distB="0" distL="0" distR="0" wp14:anchorId="000E59E1" wp14:editId="3810CC98">
@@ -278,7 +263,7 @@
                     <pic:cNvPicPr/>
                   </pic:nvPicPr>
                   <pic:blipFill>
-                    <a:blip r:embed="rId6"/>
+                    <a:blip r:embed="rId7"/>
                     <a:stretch>
                       <a:fillRect/>
                     </a:stretch>
@@ -310,6 +295,7 @@
         <w:rPr>
           <w:b/>
           <w:bCs/>
+          <w:noProof/>
         </w:rPr>
         <w:drawing>
           <wp:inline distT="0" distB="0" distL="0" distR="0" wp14:anchorId="30CAA5BD" wp14:editId="1DA92D3D">
@@ -327,7 +313,7 @@
                     <pic:cNvPicPr/>
                   </pic:nvPicPr>
                   <pic:blipFill>
-                    <a:blip r:embed="rId7"/>
+                    <a:blip r:embed="rId8"/>
                     <a:stretch>
                       <a:fillRect/>
                     </a:stretch>
@@ -353,17 +339,7 @@
         <w:t>M</w:t>
       </w:r>
       <w:r>
-        <w:t>entre </w:t>
-      </w:r>
-      <w:proofErr w:type="spellStart"/>
-      <w:proofErr w:type="gramStart"/>
-      <w:r>
-        <w:t>NotificaCreator</w:t>
-      </w:r>
-      <w:proofErr w:type="spellEnd"/>
-      <w:proofErr w:type="gramEnd"/>
-      <w:r>
-        <w:t> è il </w:t>
+        <w:t>entre NotificaCreator è il </w:t>
       </w:r>
       <w:r>
         <w:rPr>
@@ -373,40 +349,30 @@
         <w:t>Creator</w:t>
       </w:r>
       <w:r>
-        <w:t xml:space="preserve"> che dichiara il </w:t>
-      </w:r>
-      <w:proofErr w:type="spellStart"/>
-      <w:r>
-        <w:t>factory</w:t>
-      </w:r>
-      <w:proofErr w:type="spellEnd"/>
-      <w:r>
-        <w:t xml:space="preserve"> </w:t>
-      </w:r>
-      <w:proofErr w:type="spellStart"/>
-      <w:r>
-        <w:t>method</w:t>
-      </w:r>
-      <w:proofErr w:type="spellEnd"/>
-      <w:r>
-        <w:t> </w:t>
-      </w:r>
-      <w:proofErr w:type="spellStart"/>
-      <w:proofErr w:type="gramStart"/>
-      <w:r>
-        <w:t>creaNotifica</w:t>
-      </w:r>
-      <w:proofErr w:type="spellEnd"/>
-      <w:r>
-        <w:t>(</w:t>
-      </w:r>
-      <w:proofErr w:type="gramEnd"/>
-      <w:r>
-        <w:t xml:space="preserve">). </w:t>
-      </w:r>
-    </w:p>
-    <w:p>
-      <w:r>
+        <w:t> che dichiara il factory method creaNotifica()</w:t>
+      </w:r>
+      <w:r>
+        <w:t xml:space="preserve">, a lui non interessa quale classe concreta dovrà poi svolgere l’operazione perché userà il tipo </w:t>
+      </w:r>
+      <w:r>
+        <w:rPr>
+          <w:i/>
+          <w:iCs/>
+        </w:rPr>
+        <w:t>Notifica</w:t>
+      </w:r>
+      <w:r>
+        <w:t xml:space="preserve"> definito dall’interfaccia</w:t>
+      </w:r>
+      <w:r>
+        <w:t xml:space="preserve">. </w:t>
+      </w:r>
+    </w:p>
+    <w:p>
+      <w:r>
+        <w:rPr>
+          <w:noProof/>
+        </w:rPr>
         <w:drawing>
           <wp:inline distT="0" distB="0" distL="0" distR="0" wp14:anchorId="1206B1F6" wp14:editId="401E0FC4">
             <wp:extent cx="6645910" cy="895985"/>
@@ -423,7 +389,7 @@
                     <pic:cNvPicPr/>
                   </pic:nvPicPr>
                   <pic:blipFill>
-                    <a:blip r:embed="rId8"/>
+                    <a:blip r:embed="rId9"/>
                     <a:stretch>
                       <a:fillRect/>
                     </a:stretch>
@@ -445,34 +411,9 @@
       </w:r>
     </w:p>
     <w:p>
-      <w:pPr>
-        <w:rPr>
-          <w:u w:val="single"/>
-        </w:rPr>
-      </w:pPr>
-    </w:p>
-    <w:p>
-      <w:r>
-        <w:t>Le classi </w:t>
-      </w:r>
-      <w:proofErr w:type="spellStart"/>
-      <w:r>
-        <w:t>EmailCreator</w:t>
-      </w:r>
-      <w:proofErr w:type="spellEnd"/>
-      <w:r>
-        <w:t> e </w:t>
-      </w:r>
-      <w:proofErr w:type="spellStart"/>
-      <w:r>
-        <w:t>SmsCreator</w:t>
-      </w:r>
-      <w:proofErr w:type="spellEnd"/>
-      <w:r>
-        <w:t> sono i </w:t>
-      </w:r>
-      <w:proofErr w:type="spellStart"/>
-      <w:proofErr w:type="gramStart"/>
+      <w:r>
+        <w:t>Le classi EmailCreator e SmsCreator sono i </w:t>
+      </w:r>
       <w:r>
         <w:rPr>
           <w:b/>
@@ -480,13 +421,23 @@
         </w:rPr>
         <w:t>ConcreteCreator</w:t>
       </w:r>
-      <w:proofErr w:type="spellEnd"/>
-      <w:proofErr w:type="gramEnd"/>
-      <w:r>
-        <w:t xml:space="preserve">, perché decidono quale prodotto concreto </w:t>
-      </w:r>
-      <w:r>
-        <w:t>restituire.</w:t>
+      <w:r>
+        <w:t xml:space="preserve">, perché </w:t>
+      </w:r>
+      <w:r>
+        <w:t>ritornano</w:t>
+      </w:r>
+      <w:r>
+        <w:t xml:space="preserve"> </w:t>
+      </w:r>
+      <w:r>
+        <w:t>il</w:t>
+      </w:r>
+      <w:r>
+        <w:t xml:space="preserve"> prodotto concreto</w:t>
+      </w:r>
+      <w:r>
+        <w:t>.</w:t>
       </w:r>
     </w:p>
     <w:p>
@@ -494,6 +445,10 @@
         <w:spacing w:after="0"/>
       </w:pPr>
       <w:r>
+        <w:rPr>
+          <w:noProof/>
+        </w:rPr>
+        <w:lastRenderedPageBreak/>
         <w:drawing>
           <wp:inline distT="0" distB="0" distL="0" distR="0" wp14:anchorId="3D2DA243" wp14:editId="5555BF8E">
             <wp:extent cx="6645910" cy="635000"/>
@@ -510,7 +465,7 @@
                     <pic:cNvPicPr/>
                   </pic:nvPicPr>
                   <pic:blipFill>
-                    <a:blip r:embed="rId9"/>
+                    <a:blip r:embed="rId10"/>
                     <a:stretch>
                       <a:fillRect/>
                     </a:stretch>
@@ -536,6 +491,9 @@
         <w:spacing w:after="0"/>
       </w:pPr>
       <w:r>
+        <w:rPr>
+          <w:noProof/>
+        </w:rPr>
         <w:drawing>
           <wp:inline distT="0" distB="0" distL="0" distR="0" wp14:anchorId="5744A3F6" wp14:editId="05CBA250">
             <wp:extent cx="6645910" cy="669925"/>
@@ -552,7 +510,7 @@
                     <pic:cNvPicPr/>
                   </pic:nvPicPr>
                   <pic:blipFill>
-                    <a:blip r:embed="rId10"/>
+                    <a:blip r:embed="rId11"/>
                     <a:stretch>
                       <a:fillRect/>
                     </a:stretch>
@@ -590,74 +548,19 @@
     </w:p>
     <w:p>
       <w:r>
-        <w:lastRenderedPageBreak/>
-        <w:t>Il metodo </w:t>
-      </w:r>
-      <w:proofErr w:type="spellStart"/>
-      <w:proofErr w:type="gramStart"/>
-      <w:r>
-        <w:t>creaNotifica</w:t>
-      </w:r>
-      <w:proofErr w:type="spellEnd"/>
-      <w:r>
-        <w:t>(</w:t>
-      </w:r>
-      <w:proofErr w:type="gramEnd"/>
-      <w:r>
-        <w:t xml:space="preserve">) è il cuore del pattern, perché definisce il punto in cui viene creato il </w:t>
-      </w:r>
-      <w:r>
-        <w:t>prodotto.</w:t>
-      </w:r>
-      <w:r>
-        <w:t xml:space="preserve"> La classe astratta </w:t>
-      </w:r>
-      <w:proofErr w:type="spellStart"/>
-      <w:proofErr w:type="gramStart"/>
-      <w:r>
-        <w:t>NotificaCreator</w:t>
-      </w:r>
-      <w:proofErr w:type="spellEnd"/>
-      <w:proofErr w:type="gramEnd"/>
-      <w:r>
-        <w:t> contiene anche il metodo </w:t>
-      </w:r>
-      <w:proofErr w:type="spellStart"/>
-      <w:proofErr w:type="gramStart"/>
-      <w:r>
-        <w:t>mandaNotifica</w:t>
-      </w:r>
-      <w:proofErr w:type="spellEnd"/>
-      <w:r>
-        <w:t>(</w:t>
-      </w:r>
-      <w:proofErr w:type="gramEnd"/>
-      <w:r>
-        <w:t xml:space="preserve">), che usa il prodotto restituito dal </w:t>
-      </w:r>
-      <w:proofErr w:type="spellStart"/>
-      <w:r>
-        <w:t>factory</w:t>
-      </w:r>
-      <w:proofErr w:type="spellEnd"/>
-      <w:r>
-        <w:t xml:space="preserve"> </w:t>
-      </w:r>
-      <w:proofErr w:type="spellStart"/>
-      <w:r>
-        <w:t>method</w:t>
-      </w:r>
-      <w:proofErr w:type="spellEnd"/>
-      <w:r>
-        <w:t xml:space="preserve"> e richiama </w:t>
-      </w:r>
-      <w:proofErr w:type="gramStart"/>
-      <w:r>
-        <w:t>invia(</w:t>
-      </w:r>
-      <w:proofErr w:type="gramEnd"/>
-      <w:r>
-        <w:t xml:space="preserve">), separando così la logica di creazione dalla logica di </w:t>
+        <w:t xml:space="preserve">Il metodo creaNotifica() è il cuore del pattern, perché definisce il punto in cui viene creato il </w:t>
+      </w:r>
+      <w:r>
+        <w:t>prodotto</w:t>
+      </w:r>
+      <w:r>
+        <w:t xml:space="preserve"> concreto</w:t>
+      </w:r>
+      <w:r>
+        <w:t>.</w:t>
+      </w:r>
+      <w:r>
+        <w:t xml:space="preserve"> La classe astratta NotificaCreator contiene anche il metodo mandaNotifica(), che usa il prodotto restituito dal factory method e richiama invia(), separando così la logica di creazione dalla logica di </w:t>
       </w:r>
       <w:r>
         <w:t>utilizzo.</w:t>
@@ -686,17 +589,7 @@
         <w:t>concrete.</w:t>
       </w:r>
       <w:r>
-        <w:t xml:space="preserve"> La classe astratta </w:t>
-      </w:r>
-      <w:proofErr w:type="spellStart"/>
-      <w:proofErr w:type="gramStart"/>
-      <w:r>
-        <w:t>NotificaCreator</w:t>
-      </w:r>
-      <w:proofErr w:type="spellEnd"/>
-      <w:proofErr w:type="gramEnd"/>
-      <w:r>
-        <w:t xml:space="preserve"> esiste perché il flusso generale è sempre lo stesso, mentre cambia solo il tipo concreto di oggetto creato; per questo la creazione viene delegata alle </w:t>
+        <w:t xml:space="preserve"> La classe astratta NotificaCreator esiste perché il flusso generale è sempre lo stesso, mentre cambia solo il tipo concreto di oggetto creato; per questo la creazione viene delegata alle </w:t>
       </w:r>
       <w:r>
         <w:t>sottoclassi.</w:t>
@@ -719,58 +612,16 @@
     </w:p>
     <w:p>
       <w:r>
-        <w:t>Se il client usa </w:t>
-      </w:r>
-      <w:proofErr w:type="spellStart"/>
-      <w:r>
-        <w:t>EmailCreator</w:t>
-      </w:r>
-      <w:proofErr w:type="spellEnd"/>
-      <w:r>
-        <w:t>, il metodo </w:t>
-      </w:r>
-      <w:proofErr w:type="spellStart"/>
-      <w:proofErr w:type="gramStart"/>
-      <w:r>
-        <w:t>creaNotifica</w:t>
-      </w:r>
-      <w:proofErr w:type="spellEnd"/>
-      <w:r>
-        <w:t>(</w:t>
-      </w:r>
-      <w:proofErr w:type="gramEnd"/>
-      <w:r>
-        <w:t>) restituirà un oggetto </w:t>
-      </w:r>
-      <w:proofErr w:type="spellStart"/>
-      <w:r>
-        <w:t>EmailNotifica</w:t>
-      </w:r>
-      <w:proofErr w:type="spellEnd"/>
-      <w:r>
-        <w:t>.</w:t>
-      </w:r>
-      <w:r>
-        <w:t xml:space="preserve"> Se invece usa </w:t>
-      </w:r>
-      <w:proofErr w:type="spellStart"/>
-      <w:r>
-        <w:t>SmsCreator</w:t>
-      </w:r>
-      <w:proofErr w:type="spellEnd"/>
-      <w:r>
-        <w:t>, verrà creato un oggetto </w:t>
-      </w:r>
-      <w:proofErr w:type="spellStart"/>
-      <w:r>
-        <w:t>SmsNotifica</w:t>
-      </w:r>
-      <w:proofErr w:type="spellEnd"/>
-      <w:r>
-        <w:t>, ma il client continuerà a lavorare sempre con il tipo generale </w:t>
-      </w:r>
-      <w:r>
-        <w:t>Notifica.</w:t>
+        <w:t>Se il client usa EmailCreator, il metodo creaNotifica() restituirà un oggetto </w:t>
+      </w:r>
+      <w:r>
+        <w:t>EmailNotifica.</w:t>
+      </w:r>
+      <w:r>
+        <w:t xml:space="preserve"> Se invece usa SmsCreator, verrà creato un oggetto SmsNotifica, ma il client continuerà </w:t>
+      </w:r>
+      <w:r>
+        <w:t>a usare classi che seguono il contratto definito dall’interfaccia Notifica.</w:t>
       </w:r>
     </w:p>
     <w:p>
@@ -778,6 +629,9 @@
         <w:spacing w:after="0"/>
       </w:pPr>
       <w:r>
+        <w:rPr>
+          <w:noProof/>
+        </w:rPr>
         <w:drawing>
           <wp:inline distT="0" distB="0" distL="0" distR="0" wp14:anchorId="605F6653" wp14:editId="3A871023">
             <wp:extent cx="6645910" cy="1189355"/>
@@ -794,7 +648,7 @@
                     <pic:cNvPicPr/>
                   </pic:nvPicPr>
                   <pic:blipFill>
-                    <a:blip r:embed="rId11"/>
+                    <a:blip r:embed="rId12"/>
                     <a:stretch>
                       <a:fillRect/>
                     </a:stretch>
@@ -817,6 +671,9 @@
     </w:p>
     <w:p>
       <w:r>
+        <w:rPr>
+          <w:noProof/>
+        </w:rPr>
         <w:drawing>
           <wp:inline distT="0" distB="0" distL="0" distR="0" wp14:anchorId="12DB10BC" wp14:editId="791DC25A">
             <wp:extent cx="1663786" cy="311166"/>
@@ -833,7 +690,7 @@
                     <pic:cNvPicPr/>
                   </pic:nvPicPr>
                   <pic:blipFill>
-                    <a:blip r:embed="rId12"/>
+                    <a:blip r:embed="rId13"/>
                     <a:stretch>
                       <a:fillRect/>
                     </a:stretch>
@@ -871,15 +728,7 @@
     </w:p>
     <w:p>
       <w:r>
-        <w:t xml:space="preserve">Il vantaggio principale del </w:t>
-      </w:r>
-      <w:proofErr w:type="spellStart"/>
-      <w:r>
-        <w:t>Factory</w:t>
-      </w:r>
-      <w:proofErr w:type="spellEnd"/>
-      <w:r>
-        <w:t xml:space="preserve"> Method è che riduce l'accoppiamento tra il codice che usa un oggetto e il codice che lo </w:t>
+        <w:t xml:space="preserve">Il vantaggio principale del Factory Method è che riduce l'accoppiamento tra il codice che usa un oggetto e il codice che lo </w:t>
       </w:r>
       <w:r>
         <w:t>costruisce.</w:t>
@@ -891,7 +740,98 @@
         <w:t>client.</w:t>
       </w:r>
     </w:p>
-    <w:p/>
+    <w:p>
+      <w:r>
+        <w:br w:type="page"/>
+      </w:r>
+    </w:p>
+    <w:p>
+      <w:pPr>
+        <w:rPr>
+          <w:b/>
+          <w:bCs/>
+        </w:rPr>
+      </w:pPr>
+      <w:r>
+        <w:rPr>
+          <w:b/>
+          <w:bCs/>
+        </w:rPr>
+        <w:lastRenderedPageBreak/>
+        <w:t>Diagramma UML</w:t>
+      </w:r>
+    </w:p>
+    <w:p>
+      <w:pPr>
+        <w:rPr>
+          <w:u w:val="single"/>
+        </w:rPr>
+      </w:pPr>
+      <w:r>
+        <w:rPr>
+          <w:noProof/>
+          <w:u w:val="single"/>
+        </w:rPr>
+        <w:drawing>
+          <wp:inline distT="0" distB="0" distL="0" distR="0" wp14:anchorId="65AEF039" wp14:editId="06542537">
+            <wp:extent cx="6645910" cy="3416440"/>
+            <wp:effectExtent l="0" t="0" r="2540" b="0"/>
+            <wp:docPr id="96980493" name="Immagine 1"/>
+            <wp:cNvGraphicFramePr>
+              <a:graphicFrameLocks xmlns:a="http://schemas.openxmlformats.org/drawingml/2006/main" noChangeAspect="1"/>
+            </wp:cNvGraphicFramePr>
+            <a:graphic xmlns:a="http://schemas.openxmlformats.org/drawingml/2006/main">
+              <a:graphicData uri="http://schemas.openxmlformats.org/drawingml/2006/picture">
+                <pic:pic xmlns:pic="http://schemas.openxmlformats.org/drawingml/2006/picture">
+                  <pic:nvPicPr>
+                    <pic:cNvPr id="96980493" name="Immagine 96980493"/>
+                    <pic:cNvPicPr/>
+                  </pic:nvPicPr>
+                  <pic:blipFill rotWithShape="1">
+                    <a:blip r:embed="rId14">
+                      <a:extLst>
+                        <a:ext uri="{28A0092B-C50C-407E-A947-70E740481C1C}">
+                          <a14:useLocalDpi xmlns:a14="http://schemas.microsoft.com/office/drawing/2010/main" val="0"/>
+                        </a:ext>
+                      </a:extLst>
+                    </a:blip>
+                    <a:srcRect b="4809"/>
+                    <a:stretch>
+                      <a:fillRect/>
+                    </a:stretch>
+                  </pic:blipFill>
+                  <pic:spPr bwMode="auto">
+                    <a:xfrm>
+                      <a:off x="0" y="0"/>
+                      <a:ext cx="6645910" cy="3416440"/>
+                    </a:xfrm>
+                    <a:prstGeom prst="rect">
+                      <a:avLst/>
+                    </a:prstGeom>
+                    <a:ln>
+                      <a:noFill/>
+                    </a:ln>
+                    <a:extLst>
+                      <a:ext uri="{53640926-AAD7-44D8-BBD7-CCE9431645EC}">
+                        <a14:shadowObscured xmlns:a14="http://schemas.microsoft.com/office/drawing/2010/main"/>
+                      </a:ext>
+                    </a:extLst>
+                  </pic:spPr>
+                </pic:pic>
+              </a:graphicData>
+            </a:graphic>
+          </wp:inline>
+        </w:drawing>
+      </w:r>
+    </w:p>
+    <w:p>
+      <w:r>
+        <w:t xml:space="preserve">Si </w:t>
+      </w:r>
+      <w:r>
+        <w:t>nota da subito come abbiamo due gerarchie differenti, la prima sulla sinistra definisce come l’oggetto deve comportarsi e quali funzioni deve soddisfare, dall’altra, sulla destra si nota come le funzioni dell’oggetto servano a svolgere un’operazione specifica, cioè quella di mandare una notifica. Il soddisfacimento di questa operazione non sarebbe mai stato possibile senza l’uso della gerarchia di sinistra. Il client finale in questo caso però dipende sia dalla creazione dell’oggetto; quindi, la gerarchia di destra e sia da come l’oggetto è definito, cioè la gerarchia di sinistra, non posso quindi svolgere operazioni con questi oggetti che richiedano nuovi metodi dell’oggetto stesso senza andare ad aprire il codice e violare il principio di open/closed. Un esempio di come questo pattern sia restrittivo è: se volessi inviare una nuova notifica di tipo immagine, dovrei rimodificare tutta la parte sinistra poiché l’oggetto concreto non è stato definito per quello scopo, al contrario però se volessi utilizzare gli stessi oggetti con gli stessi metodi per risolvere un’altra operazione non mi basterebbe altro che aggiungere un nuovo modulo creator.</w:t>
+      </w:r>
+    </w:p>
     <w:sectPr>
       <w:pgSz w:w="11906" w:h="16838"/>
       <w:pgMar w:top="720" w:right="720" w:bottom="720" w:left="720" w:header="708" w:footer="708" w:gutter="0"/>
@@ -900,6 +840,100 @@
     </w:sectPr>
   </w:body>
 </w:document>
+</file>
+
+<file path=word/numbering.xml><?xml version="1.0" encoding="utf-8"?>
+<w:numbering xmlns:wpc="http://schemas.microsoft.com/office/word/2010/wordprocessingCanvas" xmlns:cx="http://schemas.microsoft.com/office/drawing/2014/chartex" xmlns:cx1="http://schemas.microsoft.com/office/drawing/2015/9/8/chartex" xmlns:cx2="http://schemas.microsoft.com/office/drawing/2015/10/21/chartex" xmlns:cx3="http://schemas.microsoft.com/office/drawing/2016/5/9/chartex" xmlns:cx4="http://schemas.microsoft.com/office/drawing/2016/5/10/chartex" xmlns:cx5="http://schemas.microsoft.com/office/drawing/2016/5/11/chartex" xmlns:cx6="http://schemas.microsoft.com/office/drawing/2016/5/12/chartex" xmlns:cx7="http://schemas.microsoft.com/office/drawing/2016/5/13/chartex" xmlns:cx8="http://schemas.microsoft.com/office/drawing/2016/5/14/chartex" xmlns:mc="http://schemas.openxmlformats.org/markup-compatibility/2006" xmlns:aink="http://schemas.microsoft.com/office/drawing/2016/ink" xmlns:am3d="http://schemas.microsoft.com/office/drawing/2017/model3d" xmlns:o="urn:schemas-microsoft-com:office:office" xmlns:oel="http://schemas.microsoft.com/office/2019/extlst" xmlns:r="http://schemas.openxmlformats.org/officeDocument/2006/relationships" xmlns:m="http://schemas.openxmlformats.org/officeDocument/2006/math" xmlns:v="urn:schemas-microsoft-com:vml" xmlns:wp14="http://schemas.microsoft.com/office/word/2010/wordprocessingDrawing" xmlns:wp="http://schemas.openxmlformats.org/drawingml/2006/wordprocessingDrawing" xmlns:w10="urn:schemas-microsoft-com:office:word" xmlns:w="http://schemas.openxmlformats.org/wordprocessingml/2006/main" xmlns:w14="http://schemas.microsoft.com/office/word/2010/wordml" xmlns:w15="http://schemas.microsoft.com/office/word/2012/wordml" xmlns:w16cex="http://schemas.microsoft.com/office/word/2018/wordml/cex" xmlns:w16cid="http://schemas.microsoft.com/office/word/2016/wordml/cid" xmlns:w16="http://schemas.microsoft.com/office/word/2018/wordml" xmlns:w16du="http://schemas.microsoft.com/office/word/2023/wordml/word16du" xmlns:w16sdtdh="http://schemas.microsoft.com/office/word/2020/wordml/sdtdatahash" xmlns:w16sdtfl="http://schemas.microsoft.com/office/word/2024/wordml/sdtformatlock" xmlns:w16se="http://schemas.microsoft.com/office/word/2015/wordml/symex" xmlns:wpg="http://schemas.microsoft.com/office/word/2010/wordprocessingGroup" xmlns:wpi="http://schemas.microsoft.com/office/word/2010/wordprocessingInk" xmlns:wne="http://schemas.microsoft.com/office/word/2006/wordml" xmlns:wps="http://schemas.microsoft.com/office/word/2010/wordprocessingShape" mc:Ignorable="w14 w15 w16se w16cid w16 w16cex w16sdtdh w16sdtfl w16du wp14">
+  <w:abstractNum w:abstractNumId="0" w15:restartNumberingAfterBreak="0">
+    <w:nsid w:val="0B5D1CD1"/>
+    <w:multiLevelType w:val="hybridMultilevel"/>
+    <w:tmpl w:val="E02C80A2"/>
+    <w:lvl w:ilvl="0" w:tplc="04100011">
+      <w:start w:val="1"/>
+      <w:numFmt w:val="decimal"/>
+      <w:lvlText w:val="%1)"/>
+      <w:lvlJc w:val="left"/>
+      <w:pPr>
+        <w:ind w:left="720" w:hanging="360"/>
+      </w:pPr>
+    </w:lvl>
+    <w:lvl w:ilvl="1" w:tplc="04100019" w:tentative="1">
+      <w:start w:val="1"/>
+      <w:numFmt w:val="lowerLetter"/>
+      <w:lvlText w:val="%2."/>
+      <w:lvlJc w:val="left"/>
+      <w:pPr>
+        <w:ind w:left="1440" w:hanging="360"/>
+      </w:pPr>
+    </w:lvl>
+    <w:lvl w:ilvl="2" w:tplc="0410001B" w:tentative="1">
+      <w:start w:val="1"/>
+      <w:numFmt w:val="lowerRoman"/>
+      <w:lvlText w:val="%3."/>
+      <w:lvlJc w:val="right"/>
+      <w:pPr>
+        <w:ind w:left="2160" w:hanging="180"/>
+      </w:pPr>
+    </w:lvl>
+    <w:lvl w:ilvl="3" w:tplc="0410000F" w:tentative="1">
+      <w:start w:val="1"/>
+      <w:numFmt w:val="decimal"/>
+      <w:lvlText w:val="%4."/>
+      <w:lvlJc w:val="left"/>
+      <w:pPr>
+        <w:ind w:left="2880" w:hanging="360"/>
+      </w:pPr>
+    </w:lvl>
+    <w:lvl w:ilvl="4" w:tplc="04100019" w:tentative="1">
+      <w:start w:val="1"/>
+      <w:numFmt w:val="lowerLetter"/>
+      <w:lvlText w:val="%5."/>
+      <w:lvlJc w:val="left"/>
+      <w:pPr>
+        <w:ind w:left="3600" w:hanging="360"/>
+      </w:pPr>
+    </w:lvl>
+    <w:lvl w:ilvl="5" w:tplc="0410001B" w:tentative="1">
+      <w:start w:val="1"/>
+      <w:numFmt w:val="lowerRoman"/>
+      <w:lvlText w:val="%6."/>
+      <w:lvlJc w:val="right"/>
+      <w:pPr>
+        <w:ind w:left="4320" w:hanging="180"/>
+      </w:pPr>
+    </w:lvl>
+    <w:lvl w:ilvl="6" w:tplc="0410000F" w:tentative="1">
+      <w:start w:val="1"/>
+      <w:numFmt w:val="decimal"/>
+      <w:lvlText w:val="%7."/>
+      <w:lvlJc w:val="left"/>
+      <w:pPr>
+        <w:ind w:left="5040" w:hanging="360"/>
+      </w:pPr>
+    </w:lvl>
+    <w:lvl w:ilvl="7" w:tplc="04100019" w:tentative="1">
+      <w:start w:val="1"/>
+      <w:numFmt w:val="lowerLetter"/>
+      <w:lvlText w:val="%8."/>
+      <w:lvlJc w:val="left"/>
+      <w:pPr>
+        <w:ind w:left="5760" w:hanging="360"/>
+      </w:pPr>
+    </w:lvl>
+    <w:lvl w:ilvl="8" w:tplc="0410001B" w:tentative="1">
+      <w:start w:val="1"/>
+      <w:numFmt w:val="lowerRoman"/>
+      <w:lvlText w:val="%9."/>
+      <w:lvlJc w:val="right"/>
+      <w:pPr>
+        <w:ind w:left="6480" w:hanging="180"/>
+      </w:pPr>
+    </w:lvl>
+  </w:abstractNum>
+  <w:num w:numId="1" w16cid:durableId="192153103">
+    <w:abstractNumId w:val="0"/>
+  </w:num>
+</w:numbering>
 </file>
 
 <file path=word/styles.xml><?xml version="1.0" encoding="utf-8"?>

</xml_diff>